<commit_message>
Sprint 2: Wizard nav + Step 1
- WizardLayout with progress bar, collapsible sidebar, and nav
- Zustand store with full step1-step7 schema and localStorage persist
- Step1StudyArea: country/state dropdowns, pollutant selector, year picker, Mapbox map
- Bundled countries.json and us-states.json data files
- Natural Earth GeoJSON download script and raw boundary files
- Updated routes to nest analysis steps under WizardLayout
- Added .env.local to .gitignore (Mapbox token)

Co-Authored-By: Claude Opus 4.6 (1M context) <noreply@anthropic.com>
</commit_message>
<xml_diff>
--- a/docs/HIA_Internal_Beta_Build_Plan_v2.docx
+++ b/docs/HIA_Internal_Beta_Build_Plan_v2.docx
@@ -7405,10 +7405,16 @@
             </w:tcMar>
           </w:tcPr>
           <w:p>
-            <w:r>
-              <w:rPr>
-                <w:sz w:val="20"/>
-                <w:szCs w:val="20"/>
+            <w:pPr>
+              <w:rPr>
+                <w:lang w:val="es-ES"/>
+              </w:rPr>
+            </w:pPr>
+            <w:r>
+              <w:rPr>
+                <w:sz w:val="20"/>
+                <w:szCs w:val="20"/>
+                <w:lang w:val="es-ES"/>
               </w:rPr>
               <w:t>van Donkelaar et al. V6</w:t>
             </w:r>
@@ -19048,11 +19054,61 @@
           <w:lang w:val="es-ES"/>
         </w:rPr>
       </w:pPr>
+      <w:proofErr w:type="spellStart"/>
       <w:r>
         <w:rPr>
           <w:lang w:val="es-ES"/>
         </w:rPr>
-        <w:t>Pre-cached: U.S. (tract), Mexico (municipio), Brazil (municipio), India (district), China (prefecture).</w:t>
+        <w:t>Pre-cached</w:t>
+      </w:r>
+      <w:proofErr w:type="spellEnd"/>
+      <w:r>
+        <w:rPr>
+          <w:lang w:val="es-ES"/>
+        </w:rPr>
+        <w:t>: U.S. (</w:t>
+      </w:r>
+      <w:proofErr w:type="spellStart"/>
+      <w:r>
+        <w:rPr>
+          <w:lang w:val="es-ES"/>
+        </w:rPr>
+        <w:t>tract</w:t>
+      </w:r>
+      <w:proofErr w:type="spellEnd"/>
+      <w:r>
+        <w:rPr>
+          <w:lang w:val="es-ES"/>
+        </w:rPr>
+        <w:t>), Mexico (municipio), Brazil (municipio), India (</w:t>
+      </w:r>
+      <w:proofErr w:type="spellStart"/>
+      <w:r>
+        <w:rPr>
+          <w:lang w:val="es-ES"/>
+        </w:rPr>
+        <w:t>district</w:t>
+      </w:r>
+      <w:proofErr w:type="spellEnd"/>
+      <w:r>
+        <w:rPr>
+          <w:lang w:val="es-ES"/>
+        </w:rPr>
+        <w:t>), China (</w:t>
+      </w:r>
+      <w:proofErr w:type="spellStart"/>
+      <w:r>
+        <w:rPr>
+          <w:lang w:val="es-ES"/>
+        </w:rPr>
+        <w:t>prefecture</w:t>
+      </w:r>
+      <w:proofErr w:type="spellEnd"/>
+      <w:r>
+        <w:rPr>
+          <w:lang w:val="es-ES"/>
+        </w:rPr>
+        <w:t>).</w:t>
       </w:r>
     </w:p>
     <w:p>

</xml_diff>

<commit_message>
docs: commit pre-existing edit to HIA internal beta build plan
Binary .docx that was already modified in the working tree at the start of
this session (not authored here); committing to keep the tree clean.

Co-Authored-By: Claude Opus 4.8 <noreply@anthropic.com>
</commit_message>
<xml_diff>
--- a/docs/HIA_Internal_Beta_Build_Plan_v2.docx
+++ b/docs/HIA_Internal_Beta_Build_Plan_v2.docx
@@ -83,74 +83,8 @@
     </w:p>
     <w:p>
       <w:pPr>
-        <w:spacing w:after="100"/>
-        <w:jc w:val="center"/>
-      </w:pPr>
-      <w:r>
-        <w:rPr>
-          <w:i/>
-          <w:iCs/>
-          <w:color w:val="27AE60"/>
-          <w:sz w:val="20"/>
-          <w:szCs w:val="20"/>
-        </w:rPr>
-        <w:t xml:space="preserve">No admin rights required — No Docker — Runs entirely in </w:t>
-      </w:r>
-      <w:proofErr w:type="spellStart"/>
-      <w:r>
-        <w:rPr>
-          <w:i/>
-          <w:iCs/>
-          <w:color w:val="27AE60"/>
-          <w:sz w:val="20"/>
-          <w:szCs w:val="20"/>
-        </w:rPr>
-        <w:t>userspace</w:t>
-      </w:r>
-      <w:proofErr w:type="spellEnd"/>
-    </w:p>
-    <w:p>
-      <w:pPr>
         <w:spacing w:before="1000"/>
       </w:pPr>
-    </w:p>
-    <w:p>
-      <w:pPr>
-        <w:spacing w:after="80"/>
-        <w:jc w:val="center"/>
-      </w:pPr>
-      <w:r>
-        <w:rPr>
-          <w:color w:val="666666"/>
-        </w:rPr>
-        <w:t xml:space="preserve">Version </w:t>
-      </w:r>
-      <w:proofErr w:type="gramStart"/>
-      <w:r>
-        <w:rPr>
-          <w:color w:val="666666"/>
-        </w:rPr>
-        <w:t>4.0  |</w:t>
-      </w:r>
-      <w:proofErr w:type="gramEnd"/>
-      <w:r>
-        <w:rPr>
-          <w:color w:val="666666"/>
-        </w:rPr>
-        <w:t xml:space="preserve">  March 2026</w:t>
-      </w:r>
-    </w:p>
-    <w:p>
-      <w:pPr>
-        <w:spacing w:after="80"/>
-        <w:jc w:val="center"/>
-      </w:pPr>
-      <w:r>
-        <w:rPr>
-          <w:color w:val="666666"/>
-        </w:rPr>
-        <w:t>Veronica Southerland, PhD, MPH</w:t>
-      </w:r>
     </w:p>
     <w:p>
       <w:r>
@@ -6216,12 +6150,6 @@
         <w:gridCol w:w="9360"/>
       </w:tblGrid>
       <w:tr>
-        <w:tblPrEx>
-          <w:tblCellMar>
-            <w:top w:w="0" w:type="dxa"/>
-            <w:bottom w:w="0" w:type="dxa"/>
-          </w:tblCellMar>
-        </w:tblPrEx>
         <w:tc>
           <w:tcPr>
             <w:tcW w:w="9360" w:type="dxa"/>
@@ -6838,12 +6766,6 @@
         <w:gridCol w:w="9360"/>
       </w:tblGrid>
       <w:tr>
-        <w:tblPrEx>
-          <w:tblCellMar>
-            <w:top w:w="0" w:type="dxa"/>
-            <w:bottom w:w="0" w:type="dxa"/>
-          </w:tblCellMar>
-        </w:tblPrEx>
         <w:tc>
           <w:tcPr>
             <w:tcW w:w="9360" w:type="dxa"/>
@@ -7225,12 +7147,6 @@
         <w:gridCol w:w="3760"/>
       </w:tblGrid>
       <w:tr>
-        <w:tblPrEx>
-          <w:tblCellMar>
-            <w:top w:w="0" w:type="dxa"/>
-            <w:bottom w:w="0" w:type="dxa"/>
-          </w:tblCellMar>
-        </w:tblPrEx>
         <w:trPr>
           <w:tblHeader/>
         </w:trPr>
@@ -7356,12 +7272,6 @@
         </w:tc>
       </w:tr>
       <w:tr>
-        <w:tblPrEx>
-          <w:tblCellMar>
-            <w:top w:w="0" w:type="dxa"/>
-            <w:bottom w:w="0" w:type="dxa"/>
-          </w:tblCellMar>
-        </w:tblPrEx>
         <w:tc>
           <w:tcPr>
             <w:tcW w:w="1200" w:type="dxa"/>
@@ -7474,12 +7384,6 @@
         </w:tc>
       </w:tr>
       <w:tr>
-        <w:tblPrEx>
-          <w:tblCellMar>
-            <w:top w:w="0" w:type="dxa"/>
-            <w:bottom w:w="0" w:type="dxa"/>
-          </w:tblCellMar>
-        </w:tblPrEx>
         <w:tc>
           <w:tcPr>
             <w:tcW w:w="1200" w:type="dxa"/>
@@ -7596,12 +7500,6 @@
         </w:tc>
       </w:tr>
       <w:tr>
-        <w:tblPrEx>
-          <w:tblCellMar>
-            <w:top w:w="0" w:type="dxa"/>
-            <w:bottom w:w="0" w:type="dxa"/>
-          </w:tblCellMar>
-        </w:tblPrEx>
         <w:tc>
           <w:tcPr>
             <w:tcW w:w="1200" w:type="dxa"/>
@@ -7708,12 +7606,6 @@
         </w:tc>
       </w:tr>
       <w:tr>
-        <w:tblPrEx>
-          <w:tblCellMar>
-            <w:top w:w="0" w:type="dxa"/>
-            <w:bottom w:w="0" w:type="dxa"/>
-          </w:tblCellMar>
-        </w:tblPrEx>
         <w:tc>
           <w:tcPr>
             <w:tcW w:w="1200" w:type="dxa"/>
@@ -7820,12 +7712,6 @@
         </w:tc>
       </w:tr>
       <w:tr>
-        <w:tblPrEx>
-          <w:tblCellMar>
-            <w:top w:w="0" w:type="dxa"/>
-            <w:bottom w:w="0" w:type="dxa"/>
-          </w:tblCellMar>
-        </w:tblPrEx>
         <w:tc>
           <w:tcPr>
             <w:tcW w:w="1200" w:type="dxa"/>
@@ -7932,12 +7818,6 @@
         </w:tc>
       </w:tr>
       <w:tr>
-        <w:tblPrEx>
-          <w:tblCellMar>
-            <w:top w:w="0" w:type="dxa"/>
-            <w:bottom w:w="0" w:type="dxa"/>
-          </w:tblCellMar>
-        </w:tblPrEx>
         <w:tc>
           <w:tcPr>
             <w:tcW w:w="1200" w:type="dxa"/>
@@ -8044,12 +7924,6 @@
         </w:tc>
       </w:tr>
       <w:tr>
-        <w:tblPrEx>
-          <w:tblCellMar>
-            <w:top w:w="0" w:type="dxa"/>
-            <w:bottom w:w="0" w:type="dxa"/>
-          </w:tblCellMar>
-        </w:tblPrEx>
         <w:tc>
           <w:tcPr>
             <w:tcW w:w="1200" w:type="dxa"/>
@@ -8191,12 +8065,6 @@
         <w:gridCol w:w="9360"/>
       </w:tblGrid>
       <w:tr>
-        <w:tblPrEx>
-          <w:tblCellMar>
-            <w:top w:w="0" w:type="dxa"/>
-            <w:bottom w:w="0" w:type="dxa"/>
-          </w:tblCellMar>
-        </w:tblPrEx>
         <w:tc>
           <w:tcPr>
             <w:tcW w:w="9360" w:type="dxa"/>
@@ -8718,12 +8586,6 @@
         <w:gridCol w:w="9360"/>
       </w:tblGrid>
       <w:tr>
-        <w:tblPrEx>
-          <w:tblCellMar>
-            <w:top w:w="0" w:type="dxa"/>
-            <w:bottom w:w="0" w:type="dxa"/>
-          </w:tblCellMar>
-        </w:tblPrEx>
         <w:tc>
           <w:tcPr>
             <w:tcW w:w="9360" w:type="dxa"/>
@@ -8856,12 +8718,6 @@
         <w:gridCol w:w="9360"/>
       </w:tblGrid>
       <w:tr>
-        <w:tblPrEx>
-          <w:tblCellMar>
-            <w:top w:w="0" w:type="dxa"/>
-            <w:bottom w:w="0" w:type="dxa"/>
-          </w:tblCellMar>
-        </w:tblPrEx>
         <w:tc>
           <w:tcPr>
             <w:tcW w:w="9360" w:type="dxa"/>
@@ -9440,12 +9296,6 @@
         <w:gridCol w:w="3230"/>
       </w:tblGrid>
       <w:tr>
-        <w:tblPrEx>
-          <w:tblCellMar>
-            <w:top w:w="0" w:type="dxa"/>
-            <w:bottom w:w="0" w:type="dxa"/>
-          </w:tblCellMar>
-        </w:tblPrEx>
         <w:trPr>
           <w:tblHeader/>
         </w:trPr>
@@ -9571,12 +9421,6 @@
         </w:tc>
       </w:tr>
       <w:tr>
-        <w:tblPrEx>
-          <w:tblCellMar>
-            <w:top w:w="0" w:type="dxa"/>
-            <w:bottom w:w="0" w:type="dxa"/>
-          </w:tblCellMar>
-        </w:tblPrEx>
         <w:tc>
           <w:tcPr>
             <w:tcW w:w="1700" w:type="dxa"/>
@@ -9683,12 +9527,6 @@
         </w:tc>
       </w:tr>
       <w:tr>
-        <w:tblPrEx>
-          <w:tblCellMar>
-            <w:top w:w="0" w:type="dxa"/>
-            <w:bottom w:w="0" w:type="dxa"/>
-          </w:tblCellMar>
-        </w:tblPrEx>
         <w:tc>
           <w:tcPr>
             <w:tcW w:w="1700" w:type="dxa"/>
@@ -9804,12 +9642,6 @@
         </w:tc>
       </w:tr>
       <w:tr>
-        <w:tblPrEx>
-          <w:tblCellMar>
-            <w:top w:w="0" w:type="dxa"/>
-            <w:bottom w:w="0" w:type="dxa"/>
-          </w:tblCellMar>
-        </w:tblPrEx>
         <w:tc>
           <w:tcPr>
             <w:tcW w:w="1700" w:type="dxa"/>
@@ -9966,12 +9798,6 @@
         </w:tc>
       </w:tr>
       <w:tr>
-        <w:tblPrEx>
-          <w:tblCellMar>
-            <w:top w:w="0" w:type="dxa"/>
-            <w:bottom w:w="0" w:type="dxa"/>
-          </w:tblCellMar>
-        </w:tblPrEx>
         <w:tc>
           <w:tcPr>
             <w:tcW w:w="1700" w:type="dxa"/>
@@ -10103,12 +9929,6 @@
         </w:tc>
       </w:tr>
       <w:tr>
-        <w:tblPrEx>
-          <w:tblCellMar>
-            <w:top w:w="0" w:type="dxa"/>
-            <w:bottom w:w="0" w:type="dxa"/>
-          </w:tblCellMar>
-        </w:tblPrEx>
         <w:tc>
           <w:tcPr>
             <w:tcW w:w="1700" w:type="dxa"/>
@@ -10247,12 +10067,6 @@
         </w:tc>
       </w:tr>
       <w:tr>
-        <w:tblPrEx>
-          <w:tblCellMar>
-            <w:top w:w="0" w:type="dxa"/>
-            <w:bottom w:w="0" w:type="dxa"/>
-          </w:tblCellMar>
-        </w:tblPrEx>
         <w:tc>
           <w:tcPr>
             <w:tcW w:w="1700" w:type="dxa"/>
@@ -10393,12 +10207,6 @@
         </w:tc>
       </w:tr>
       <w:tr>
-        <w:tblPrEx>
-          <w:tblCellMar>
-            <w:top w:w="0" w:type="dxa"/>
-            <w:bottom w:w="0" w:type="dxa"/>
-          </w:tblCellMar>
-        </w:tblPrEx>
         <w:tc>
           <w:tcPr>
             <w:tcW w:w="1700" w:type="dxa"/>
@@ -10505,12 +10313,6 @@
         </w:tc>
       </w:tr>
       <w:tr>
-        <w:tblPrEx>
-          <w:tblCellMar>
-            <w:top w:w="0" w:type="dxa"/>
-            <w:bottom w:w="0" w:type="dxa"/>
-          </w:tblCellMar>
-        </w:tblPrEx>
         <w:tc>
           <w:tcPr>
             <w:tcW w:w="1700" w:type="dxa"/>
@@ -10617,12 +10419,6 @@
         </w:tc>
       </w:tr>
       <w:tr>
-        <w:tblPrEx>
-          <w:tblCellMar>
-            <w:top w:w="0" w:type="dxa"/>
-            <w:bottom w:w="0" w:type="dxa"/>
-          </w:tblCellMar>
-        </w:tblPrEx>
         <w:tc>
           <w:tcPr>
             <w:tcW w:w="1700" w:type="dxa"/>
@@ -10729,12 +10525,6 @@
         </w:tc>
       </w:tr>
       <w:tr>
-        <w:tblPrEx>
-          <w:tblCellMar>
-            <w:top w:w="0" w:type="dxa"/>
-            <w:bottom w:w="0" w:type="dxa"/>
-          </w:tblCellMar>
-        </w:tblPrEx>
         <w:tc>
           <w:tcPr>
             <w:tcW w:w="1700" w:type="dxa"/>
@@ -10841,12 +10631,6 @@
         </w:tc>
       </w:tr>
       <w:tr>
-        <w:tblPrEx>
-          <w:tblCellMar>
-            <w:top w:w="0" w:type="dxa"/>
-            <w:bottom w:w="0" w:type="dxa"/>
-          </w:tblCellMar>
-        </w:tblPrEx>
         <w:tc>
           <w:tcPr>
             <w:tcW w:w="1700" w:type="dxa"/>
@@ -10953,12 +10737,6 @@
         </w:tc>
       </w:tr>
       <w:tr>
-        <w:tblPrEx>
-          <w:tblCellMar>
-            <w:top w:w="0" w:type="dxa"/>
-            <w:bottom w:w="0" w:type="dxa"/>
-          </w:tblCellMar>
-        </w:tblPrEx>
         <w:tc>
           <w:tcPr>
             <w:tcW w:w="1700" w:type="dxa"/>
@@ -11425,12 +11203,6 @@
         <w:gridCol w:w="1760"/>
       </w:tblGrid>
       <w:tr>
-        <w:tblPrEx>
-          <w:tblCellMar>
-            <w:top w:w="0" w:type="dxa"/>
-            <w:bottom w:w="0" w:type="dxa"/>
-          </w:tblCellMar>
-        </w:tblPrEx>
         <w:trPr>
           <w:tblHeader/>
         </w:trPr>
@@ -11586,12 +11358,6 @@
         </w:tc>
       </w:tr>
       <w:tr>
-        <w:tblPrEx>
-          <w:tblCellMar>
-            <w:top w:w="0" w:type="dxa"/>
-            <w:bottom w:w="0" w:type="dxa"/>
-          </w:tblCellMar>
-        </w:tblPrEx>
         <w:tc>
           <w:tcPr>
             <w:tcW w:w="1600" w:type="dxa"/>
@@ -11733,12 +11499,6 @@
         </w:tc>
       </w:tr>
       <w:tr>
-        <w:tblPrEx>
-          <w:tblCellMar>
-            <w:top w:w="0" w:type="dxa"/>
-            <w:bottom w:w="0" w:type="dxa"/>
-          </w:tblCellMar>
-        </w:tblPrEx>
         <w:tc>
           <w:tcPr>
             <w:tcW w:w="1600" w:type="dxa"/>
@@ -11896,12 +11656,6 @@
         </w:tc>
       </w:tr>
       <w:tr>
-        <w:tblPrEx>
-          <w:tblCellMar>
-            <w:top w:w="0" w:type="dxa"/>
-            <w:bottom w:w="0" w:type="dxa"/>
-          </w:tblCellMar>
-        </w:tblPrEx>
         <w:tc>
           <w:tcPr>
             <w:tcW w:w="1600" w:type="dxa"/>
@@ -12034,12 +11788,6 @@
         </w:tc>
       </w:tr>
       <w:tr>
-        <w:tblPrEx>
-          <w:tblCellMar>
-            <w:top w:w="0" w:type="dxa"/>
-            <w:bottom w:w="0" w:type="dxa"/>
-          </w:tblCellMar>
-        </w:tblPrEx>
         <w:tc>
           <w:tcPr>
             <w:tcW w:w="1600" w:type="dxa"/>
@@ -12197,12 +11945,6 @@
         </w:tc>
       </w:tr>
       <w:tr>
-        <w:tblPrEx>
-          <w:tblCellMar>
-            <w:top w:w="0" w:type="dxa"/>
-            <w:bottom w:w="0" w:type="dxa"/>
-          </w:tblCellMar>
-        </w:tblPrEx>
         <w:tc>
           <w:tcPr>
             <w:tcW w:w="1600" w:type="dxa"/>
@@ -12335,12 +12077,6 @@
         </w:tc>
       </w:tr>
       <w:tr>
-        <w:tblPrEx>
-          <w:tblCellMar>
-            <w:top w:w="0" w:type="dxa"/>
-            <w:bottom w:w="0" w:type="dxa"/>
-          </w:tblCellMar>
-        </w:tblPrEx>
         <w:tc>
           <w:tcPr>
             <w:tcW w:w="1600" w:type="dxa"/>
@@ -12473,12 +12209,6 @@
         </w:tc>
       </w:tr>
       <w:tr>
-        <w:tblPrEx>
-          <w:tblCellMar>
-            <w:top w:w="0" w:type="dxa"/>
-            <w:bottom w:w="0" w:type="dxa"/>
-          </w:tblCellMar>
-        </w:tblPrEx>
         <w:tc>
           <w:tcPr>
             <w:tcW w:w="1600" w:type="dxa"/>
@@ -12611,12 +12341,6 @@
         </w:tc>
       </w:tr>
       <w:tr>
-        <w:tblPrEx>
-          <w:tblCellMar>
-            <w:top w:w="0" w:type="dxa"/>
-            <w:bottom w:w="0" w:type="dxa"/>
-          </w:tblCellMar>
-        </w:tblPrEx>
         <w:tc>
           <w:tcPr>
             <w:tcW w:w="1600" w:type="dxa"/>
@@ -12765,12 +12489,6 @@
         </w:tc>
       </w:tr>
       <w:tr>
-        <w:tblPrEx>
-          <w:tblCellMar>
-            <w:top w:w="0" w:type="dxa"/>
-            <w:bottom w:w="0" w:type="dxa"/>
-          </w:tblCellMar>
-        </w:tblPrEx>
         <w:tc>
           <w:tcPr>
             <w:tcW w:w="1600" w:type="dxa"/>
@@ -12903,12 +12621,6 @@
         </w:tc>
       </w:tr>
       <w:tr>
-        <w:tblPrEx>
-          <w:tblCellMar>
-            <w:top w:w="0" w:type="dxa"/>
-            <w:bottom w:w="0" w:type="dxa"/>
-          </w:tblCellMar>
-        </w:tblPrEx>
         <w:tc>
           <w:tcPr>
             <w:tcW w:w="1600" w:type="dxa"/>
@@ -13041,12 +12753,6 @@
         </w:tc>
       </w:tr>
       <w:tr>
-        <w:tblPrEx>
-          <w:tblCellMar>
-            <w:top w:w="0" w:type="dxa"/>
-            <w:bottom w:w="0" w:type="dxa"/>
-          </w:tblCellMar>
-        </w:tblPrEx>
         <w:tc>
           <w:tcPr>
             <w:tcW w:w="1600" w:type="dxa"/>
@@ -13179,12 +12885,6 @@
         </w:tc>
       </w:tr>
       <w:tr>
-        <w:tblPrEx>
-          <w:tblCellMar>
-            <w:top w:w="0" w:type="dxa"/>
-            <w:bottom w:w="0" w:type="dxa"/>
-          </w:tblCellMar>
-        </w:tblPrEx>
         <w:tc>
           <w:tcPr>
             <w:tcW w:w="1600" w:type="dxa"/>
@@ -13343,12 +13043,6 @@
         <w:gridCol w:w="9360"/>
       </w:tblGrid>
       <w:tr>
-        <w:tblPrEx>
-          <w:tblCellMar>
-            <w:top w:w="0" w:type="dxa"/>
-            <w:bottom w:w="0" w:type="dxa"/>
-          </w:tblCellMar>
-        </w:tblPrEx>
         <w:tc>
           <w:tcPr>
             <w:tcW w:w="9360" w:type="dxa"/>
@@ -13611,15 +13305,7 @@
       </w:r>
       <w:proofErr w:type="spellEnd"/>
       <w:r>
-        <w:t xml:space="preserve">/latest/miniconda.html and run it. When prompted for the </w:t>
-      </w:r>
-      <w:proofErr w:type="gramStart"/>
-      <w:r>
-        <w:t>install</w:t>
-      </w:r>
-      <w:proofErr w:type="gramEnd"/>
-      <w:r>
-        <w:t xml:space="preserve"> location, accept the default (which is inside your home directory). Then create an environment for the project:</w:t>
+        <w:t>/latest/miniconda.html and run it. When prompted for the install location, accept the default (which is inside your home directory). Then create an environment for the project:</w:t>
       </w:r>
     </w:p>
     <w:p>
@@ -13771,12 +13457,6 @@
         <w:gridCol w:w="9360"/>
       </w:tblGrid>
       <w:tr>
-        <w:tblPrEx>
-          <w:tblCellMar>
-            <w:top w:w="0" w:type="dxa"/>
-            <w:bottom w:w="0" w:type="dxa"/>
-          </w:tblCellMar>
-        </w:tblPrEx>
         <w:tc>
           <w:tcPr>
             <w:tcW w:w="9360" w:type="dxa"/>
@@ -14113,12 +13793,6 @@
         <w:gridCol w:w="1800"/>
       </w:tblGrid>
       <w:tr>
-        <w:tblPrEx>
-          <w:tblCellMar>
-            <w:top w:w="0" w:type="dxa"/>
-            <w:bottom w:w="0" w:type="dxa"/>
-          </w:tblCellMar>
-        </w:tblPrEx>
         <w:trPr>
           <w:tblHeader/>
         </w:trPr>
@@ -14244,12 +13918,6 @@
         </w:tc>
       </w:tr>
       <w:tr>
-        <w:tblPrEx>
-          <w:tblCellMar>
-            <w:top w:w="0" w:type="dxa"/>
-            <w:bottom w:w="0" w:type="dxa"/>
-          </w:tblCellMar>
-        </w:tblPrEx>
         <w:tc>
           <w:tcPr>
             <w:tcW w:w="2400" w:type="dxa"/>
@@ -14374,12 +14042,6 @@
         </w:tc>
       </w:tr>
       <w:tr>
-        <w:tblPrEx>
-          <w:tblCellMar>
-            <w:top w:w="0" w:type="dxa"/>
-            <w:bottom w:w="0" w:type="dxa"/>
-          </w:tblCellMar>
-        </w:tblPrEx>
         <w:tc>
           <w:tcPr>
             <w:tcW w:w="2400" w:type="dxa"/>
@@ -14504,12 +14166,6 @@
         </w:tc>
       </w:tr>
       <w:tr>
-        <w:tblPrEx>
-          <w:tblCellMar>
-            <w:top w:w="0" w:type="dxa"/>
-            <w:bottom w:w="0" w:type="dxa"/>
-          </w:tblCellMar>
-        </w:tblPrEx>
         <w:tc>
           <w:tcPr>
             <w:tcW w:w="2400" w:type="dxa"/>
@@ -14618,12 +14274,6 @@
         </w:tc>
       </w:tr>
       <w:tr>
-        <w:tblPrEx>
-          <w:tblCellMar>
-            <w:top w:w="0" w:type="dxa"/>
-            <w:bottom w:w="0" w:type="dxa"/>
-          </w:tblCellMar>
-        </w:tblPrEx>
         <w:tc>
           <w:tcPr>
             <w:tcW w:w="2400" w:type="dxa"/>
@@ -14732,12 +14382,6 @@
         </w:tc>
       </w:tr>
       <w:tr>
-        <w:tblPrEx>
-          <w:tblCellMar>
-            <w:top w:w="0" w:type="dxa"/>
-            <w:bottom w:w="0" w:type="dxa"/>
-          </w:tblCellMar>
-        </w:tblPrEx>
         <w:tc>
           <w:tcPr>
             <w:tcW w:w="2400" w:type="dxa"/>
@@ -14901,12 +14545,6 @@
         <w:gridCol w:w="1800"/>
       </w:tblGrid>
       <w:tr>
-        <w:tblPrEx>
-          <w:tblCellMar>
-            <w:top w:w="0" w:type="dxa"/>
-            <w:bottom w:w="0" w:type="dxa"/>
-          </w:tblCellMar>
-        </w:tblPrEx>
         <w:trPr>
           <w:tblHeader/>
         </w:trPr>
@@ -15032,12 +14670,6 @@
         </w:tc>
       </w:tr>
       <w:tr>
-        <w:tblPrEx>
-          <w:tblCellMar>
-            <w:top w:w="0" w:type="dxa"/>
-            <w:bottom w:w="0" w:type="dxa"/>
-          </w:tblCellMar>
-        </w:tblPrEx>
         <w:tc>
           <w:tcPr>
             <w:tcW w:w="2400" w:type="dxa"/>
@@ -15155,12 +14787,6 @@
         </w:tc>
       </w:tr>
       <w:tr>
-        <w:tblPrEx>
-          <w:tblCellMar>
-            <w:top w:w="0" w:type="dxa"/>
-            <w:bottom w:w="0" w:type="dxa"/>
-          </w:tblCellMar>
-        </w:tblPrEx>
         <w:tc>
           <w:tcPr>
             <w:tcW w:w="2400" w:type="dxa"/>
@@ -15269,12 +14895,6 @@
         </w:tc>
       </w:tr>
       <w:tr>
-        <w:tblPrEx>
-          <w:tblCellMar>
-            <w:top w:w="0" w:type="dxa"/>
-            <w:bottom w:w="0" w:type="dxa"/>
-          </w:tblCellMar>
-        </w:tblPrEx>
         <w:tc>
           <w:tcPr>
             <w:tcW w:w="2400" w:type="dxa"/>
@@ -15467,12 +15087,6 @@
         <w:gridCol w:w="9360"/>
       </w:tblGrid>
       <w:tr>
-        <w:tblPrEx>
-          <w:tblCellMar>
-            <w:top w:w="0" w:type="dxa"/>
-            <w:bottom w:w="0" w:type="dxa"/>
-          </w:tblCellMar>
-        </w:tblPrEx>
         <w:tc>
           <w:tcPr>
             <w:tcW w:w="9360" w:type="dxa"/>
@@ -15554,12 +15168,6 @@
         <w:gridCol w:w="2400"/>
       </w:tblGrid>
       <w:tr>
-        <w:tblPrEx>
-          <w:tblCellMar>
-            <w:top w:w="0" w:type="dxa"/>
-            <w:bottom w:w="0" w:type="dxa"/>
-          </w:tblCellMar>
-        </w:tblPrEx>
         <w:trPr>
           <w:tblHeader/>
         </w:trPr>
@@ -15697,12 +15305,6 @@
         </w:tc>
       </w:tr>
       <w:tr>
-        <w:tblPrEx>
-          <w:tblCellMar>
-            <w:top w:w="0" w:type="dxa"/>
-            <w:bottom w:w="0" w:type="dxa"/>
-          </w:tblCellMar>
-        </w:tblPrEx>
         <w:tc>
           <w:tcPr>
             <w:tcW w:w="2400" w:type="dxa"/>
@@ -15809,12 +15411,6 @@
         </w:tc>
       </w:tr>
       <w:tr>
-        <w:tblPrEx>
-          <w:tblCellMar>
-            <w:top w:w="0" w:type="dxa"/>
-            <w:bottom w:w="0" w:type="dxa"/>
-          </w:tblCellMar>
-        </w:tblPrEx>
         <w:tc>
           <w:tcPr>
             <w:tcW w:w="2400" w:type="dxa"/>
@@ -15937,12 +15533,6 @@
         </w:tc>
       </w:tr>
       <w:tr>
-        <w:tblPrEx>
-          <w:tblCellMar>
-            <w:top w:w="0" w:type="dxa"/>
-            <w:bottom w:w="0" w:type="dxa"/>
-          </w:tblCellMar>
-        </w:tblPrEx>
         <w:tc>
           <w:tcPr>
             <w:tcW w:w="2400" w:type="dxa"/>
@@ -16051,12 +15641,6 @@
         </w:tc>
       </w:tr>
       <w:tr>
-        <w:tblPrEx>
-          <w:tblCellMar>
-            <w:top w:w="0" w:type="dxa"/>
-            <w:bottom w:w="0" w:type="dxa"/>
-          </w:tblCellMar>
-        </w:tblPrEx>
         <w:tc>
           <w:tcPr>
             <w:tcW w:w="2400" w:type="dxa"/>
@@ -16163,12 +15747,6 @@
         </w:tc>
       </w:tr>
       <w:tr>
-        <w:tblPrEx>
-          <w:tblCellMar>
-            <w:top w:w="0" w:type="dxa"/>
-            <w:bottom w:w="0" w:type="dxa"/>
-          </w:tblCellMar>
-        </w:tblPrEx>
         <w:tc>
           <w:tcPr>
             <w:tcW w:w="2400" w:type="dxa"/>
@@ -16291,12 +15869,6 @@
         </w:tc>
       </w:tr>
       <w:tr>
-        <w:tblPrEx>
-          <w:tblCellMar>
-            <w:top w:w="0" w:type="dxa"/>
-            <w:bottom w:w="0" w:type="dxa"/>
-          </w:tblCellMar>
-        </w:tblPrEx>
         <w:tc>
           <w:tcPr>
             <w:tcW w:w="2400" w:type="dxa"/>
@@ -16403,12 +15975,6 @@
         </w:tc>
       </w:tr>
       <w:tr>
-        <w:tblPrEx>
-          <w:tblCellMar>
-            <w:top w:w="0" w:type="dxa"/>
-            <w:bottom w:w="0" w:type="dxa"/>
-          </w:tblCellMar>
-        </w:tblPrEx>
         <w:tc>
           <w:tcPr>
             <w:tcW w:w="2400" w:type="dxa"/>
@@ -16515,12 +16081,6 @@
         </w:tc>
       </w:tr>
       <w:tr>
-        <w:tblPrEx>
-          <w:tblCellMar>
-            <w:top w:w="0" w:type="dxa"/>
-            <w:bottom w:w="0" w:type="dxa"/>
-          </w:tblCellMar>
-        </w:tblPrEx>
         <w:tc>
           <w:tcPr>
             <w:tcW w:w="2400" w:type="dxa"/>
@@ -16734,12 +16294,6 @@
         <w:gridCol w:w="9360"/>
       </w:tblGrid>
       <w:tr>
-        <w:tblPrEx>
-          <w:tblCellMar>
-            <w:top w:w="0" w:type="dxa"/>
-            <w:bottom w:w="0" w:type="dxa"/>
-          </w:tblCellMar>
-        </w:tblPrEx>
         <w:tc>
           <w:tcPr>
             <w:tcW w:w="9360" w:type="dxa"/>
@@ -16901,12 +16455,6 @@
         <w:gridCol w:w="1660"/>
       </w:tblGrid>
       <w:tr>
-        <w:tblPrEx>
-          <w:tblCellMar>
-            <w:top w:w="0" w:type="dxa"/>
-            <w:bottom w:w="0" w:type="dxa"/>
-          </w:tblCellMar>
-        </w:tblPrEx>
         <w:trPr>
           <w:tblHeader/>
         </w:trPr>
@@ -17032,12 +16580,6 @@
         </w:tc>
       </w:tr>
       <w:tr>
-        <w:tblPrEx>
-          <w:tblCellMar>
-            <w:top w:w="0" w:type="dxa"/>
-            <w:bottom w:w="0" w:type="dxa"/>
-          </w:tblCellMar>
-        </w:tblPrEx>
         <w:tc>
           <w:tcPr>
             <w:tcW w:w="900" w:type="dxa"/>
@@ -17144,12 +16686,6 @@
         </w:tc>
       </w:tr>
       <w:tr>
-        <w:tblPrEx>
-          <w:tblCellMar>
-            <w:top w:w="0" w:type="dxa"/>
-            <w:bottom w:w="0" w:type="dxa"/>
-          </w:tblCellMar>
-        </w:tblPrEx>
         <w:tc>
           <w:tcPr>
             <w:tcW w:w="900" w:type="dxa"/>
@@ -17256,12 +16792,6 @@
         </w:tc>
       </w:tr>
       <w:tr>
-        <w:tblPrEx>
-          <w:tblCellMar>
-            <w:top w:w="0" w:type="dxa"/>
-            <w:bottom w:w="0" w:type="dxa"/>
-          </w:tblCellMar>
-        </w:tblPrEx>
         <w:tc>
           <w:tcPr>
             <w:tcW w:w="900" w:type="dxa"/>
@@ -17368,12 +16898,6 @@
         </w:tc>
       </w:tr>
       <w:tr>
-        <w:tblPrEx>
-          <w:tblCellMar>
-            <w:top w:w="0" w:type="dxa"/>
-            <w:bottom w:w="0" w:type="dxa"/>
-          </w:tblCellMar>
-        </w:tblPrEx>
         <w:tc>
           <w:tcPr>
             <w:tcW w:w="900" w:type="dxa"/>
@@ -17480,12 +17004,6 @@
         </w:tc>
       </w:tr>
       <w:tr>
-        <w:tblPrEx>
-          <w:tblCellMar>
-            <w:top w:w="0" w:type="dxa"/>
-            <w:bottom w:w="0" w:type="dxa"/>
-          </w:tblCellMar>
-        </w:tblPrEx>
         <w:tc>
           <w:tcPr>
             <w:tcW w:w="900" w:type="dxa"/>
@@ -17592,12 +17110,6 @@
         </w:tc>
       </w:tr>
       <w:tr>
-        <w:tblPrEx>
-          <w:tblCellMar>
-            <w:top w:w="0" w:type="dxa"/>
-            <w:bottom w:w="0" w:type="dxa"/>
-          </w:tblCellMar>
-        </w:tblPrEx>
         <w:tc>
           <w:tcPr>
             <w:tcW w:w="900" w:type="dxa"/>
@@ -17704,12 +17216,6 @@
         </w:tc>
       </w:tr>
       <w:tr>
-        <w:tblPrEx>
-          <w:tblCellMar>
-            <w:top w:w="0" w:type="dxa"/>
-            <w:bottom w:w="0" w:type="dxa"/>
-          </w:tblCellMar>
-        </w:tblPrEx>
         <w:tc>
           <w:tcPr>
             <w:tcW w:w="900" w:type="dxa"/>
@@ -17816,12 +17322,6 @@
         </w:tc>
       </w:tr>
       <w:tr>
-        <w:tblPrEx>
-          <w:tblCellMar>
-            <w:top w:w="0" w:type="dxa"/>
-            <w:bottom w:w="0" w:type="dxa"/>
-          </w:tblCellMar>
-        </w:tblPrEx>
         <w:tc>
           <w:tcPr>
             <w:tcW w:w="900" w:type="dxa"/>
@@ -17929,12 +17429,6 @@
         </w:tc>
       </w:tr>
       <w:tr>
-        <w:tblPrEx>
-          <w:tblCellMar>
-            <w:top w:w="0" w:type="dxa"/>
-            <w:bottom w:w="0" w:type="dxa"/>
-          </w:tblCellMar>
-        </w:tblPrEx>
         <w:tc>
           <w:tcPr>
             <w:tcW w:w="900" w:type="dxa"/>
@@ -18041,12 +17535,6 @@
         </w:tc>
       </w:tr>
       <w:tr>
-        <w:tblPrEx>
-          <w:tblCellMar>
-            <w:top w:w="0" w:type="dxa"/>
-            <w:bottom w:w="0" w:type="dxa"/>
-          </w:tblCellMar>
-        </w:tblPrEx>
         <w:tc>
           <w:tcPr>
             <w:tcW w:w="900" w:type="dxa"/>
@@ -19150,12 +18638,6 @@
         <w:gridCol w:w="9360"/>
       </w:tblGrid>
       <w:tr>
-        <w:tblPrEx>
-          <w:tblCellMar>
-            <w:top w:w="0" w:type="dxa"/>
-            <w:bottom w:w="0" w:type="dxa"/>
-          </w:tblCellMar>
-        </w:tblPrEx>
         <w:tc>
           <w:tcPr>
             <w:tcW w:w="9360" w:type="dxa"/>
@@ -19411,12 +18893,6 @@
         <w:gridCol w:w="9360"/>
       </w:tblGrid>
       <w:tr>
-        <w:tblPrEx>
-          <w:tblCellMar>
-            <w:top w:w="0" w:type="dxa"/>
-            <w:bottom w:w="0" w:type="dxa"/>
-          </w:tblCellMar>
-        </w:tblPrEx>
         <w:tc>
           <w:tcPr>
             <w:tcW w:w="9360" w:type="dxa"/>
@@ -19679,12 +19155,6 @@
         <w:gridCol w:w="4360"/>
       </w:tblGrid>
       <w:tr>
-        <w:tblPrEx>
-          <w:tblCellMar>
-            <w:top w:w="0" w:type="dxa"/>
-            <w:bottom w:w="0" w:type="dxa"/>
-          </w:tblCellMar>
-        </w:tblPrEx>
         <w:trPr>
           <w:tblHeader/>
         </w:trPr>
@@ -19780,12 +19250,6 @@
         </w:tc>
       </w:tr>
       <w:tr>
-        <w:tblPrEx>
-          <w:tblCellMar>
-            <w:top w:w="0" w:type="dxa"/>
-            <w:bottom w:w="0" w:type="dxa"/>
-          </w:tblCellMar>
-        </w:tblPrEx>
         <w:tc>
           <w:tcPr>
             <w:tcW w:w="2800" w:type="dxa"/>
@@ -19882,12 +19346,6 @@
         </w:tc>
       </w:tr>
       <w:tr>
-        <w:tblPrEx>
-          <w:tblCellMar>
-            <w:top w:w="0" w:type="dxa"/>
-            <w:bottom w:w="0" w:type="dxa"/>
-          </w:tblCellMar>
-        </w:tblPrEx>
         <w:tc>
           <w:tcPr>
             <w:tcW w:w="2800" w:type="dxa"/>
@@ -19977,12 +19435,6 @@
         </w:tc>
       </w:tr>
       <w:tr>
-        <w:tblPrEx>
-          <w:tblCellMar>
-            <w:top w:w="0" w:type="dxa"/>
-            <w:bottom w:w="0" w:type="dxa"/>
-          </w:tblCellMar>
-        </w:tblPrEx>
         <w:tc>
           <w:tcPr>
             <w:tcW w:w="2800" w:type="dxa"/>
@@ -20063,12 +19515,6 @@
         </w:tc>
       </w:tr>
       <w:tr>
-        <w:tblPrEx>
-          <w:tblCellMar>
-            <w:top w:w="0" w:type="dxa"/>
-            <w:bottom w:w="0" w:type="dxa"/>
-          </w:tblCellMar>
-        </w:tblPrEx>
         <w:tc>
           <w:tcPr>
             <w:tcW w:w="2800" w:type="dxa"/>
@@ -20158,12 +19604,6 @@
         </w:tc>
       </w:tr>
       <w:tr>
-        <w:tblPrEx>
-          <w:tblCellMar>
-            <w:top w:w="0" w:type="dxa"/>
-            <w:bottom w:w="0" w:type="dxa"/>
-          </w:tblCellMar>
-        </w:tblPrEx>
         <w:tc>
           <w:tcPr>
             <w:tcW w:w="2800" w:type="dxa"/>
@@ -20244,12 +19684,6 @@
         </w:tc>
       </w:tr>
       <w:tr>
-        <w:tblPrEx>
-          <w:tblCellMar>
-            <w:top w:w="0" w:type="dxa"/>
-            <w:bottom w:w="0" w:type="dxa"/>
-          </w:tblCellMar>
-        </w:tblPrEx>
         <w:tc>
           <w:tcPr>
             <w:tcW w:w="2800" w:type="dxa"/>
@@ -20662,12 +20096,6 @@
         <w:gridCol w:w="1460"/>
       </w:tblGrid>
       <w:tr>
-        <w:tblPrEx>
-          <w:tblCellMar>
-            <w:top w:w="0" w:type="dxa"/>
-            <w:bottom w:w="0" w:type="dxa"/>
-          </w:tblCellMar>
-        </w:tblPrEx>
         <w:trPr>
           <w:tblHeader/>
         </w:trPr>
@@ -20853,12 +20281,6 @@
         </w:tc>
       </w:tr>
       <w:tr>
-        <w:tblPrEx>
-          <w:tblCellMar>
-            <w:top w:w="0" w:type="dxa"/>
-            <w:bottom w:w="0" w:type="dxa"/>
-          </w:tblCellMar>
-        </w:tblPrEx>
         <w:tc>
           <w:tcPr>
             <w:tcW w:w="2200" w:type="dxa"/>
@@ -21017,12 +20439,6 @@
         </w:tc>
       </w:tr>
       <w:tr>
-        <w:tblPrEx>
-          <w:tblCellMar>
-            <w:top w:w="0" w:type="dxa"/>
-            <w:bottom w:w="0" w:type="dxa"/>
-          </w:tblCellMar>
-        </w:tblPrEx>
         <w:tc>
           <w:tcPr>
             <w:tcW w:w="2200" w:type="dxa"/>
@@ -21190,12 +20606,6 @@
         </w:tc>
       </w:tr>
       <w:tr>
-        <w:tblPrEx>
-          <w:tblCellMar>
-            <w:top w:w="0" w:type="dxa"/>
-            <w:bottom w:w="0" w:type="dxa"/>
-          </w:tblCellMar>
-        </w:tblPrEx>
         <w:tc>
           <w:tcPr>
             <w:tcW w:w="2200" w:type="dxa"/>
@@ -21363,12 +20773,6 @@
         </w:tc>
       </w:tr>
       <w:tr>
-        <w:tblPrEx>
-          <w:tblCellMar>
-            <w:top w:w="0" w:type="dxa"/>
-            <w:bottom w:w="0" w:type="dxa"/>
-          </w:tblCellMar>
-        </w:tblPrEx>
         <w:tc>
           <w:tcPr>
             <w:tcW w:w="2200" w:type="dxa"/>
@@ -21527,12 +20931,6 @@
         </w:tc>
       </w:tr>
       <w:tr>
-        <w:tblPrEx>
-          <w:tblCellMar>
-            <w:top w:w="0" w:type="dxa"/>
-            <w:bottom w:w="0" w:type="dxa"/>
-          </w:tblCellMar>
-        </w:tblPrEx>
         <w:tc>
           <w:tcPr>
             <w:tcW w:w="2200" w:type="dxa"/>
@@ -21691,12 +21089,6 @@
         </w:tc>
       </w:tr>
       <w:tr>
-        <w:tblPrEx>
-          <w:tblCellMar>
-            <w:top w:w="0" w:type="dxa"/>
-            <w:bottom w:w="0" w:type="dxa"/>
-          </w:tblCellMar>
-        </w:tblPrEx>
         <w:tc>
           <w:tcPr>
             <w:tcW w:w="2200" w:type="dxa"/>
@@ -21855,12 +21247,6 @@
         </w:tc>
       </w:tr>
       <w:tr>
-        <w:tblPrEx>
-          <w:tblCellMar>
-            <w:top w:w="0" w:type="dxa"/>
-            <w:bottom w:w="0" w:type="dxa"/>
-          </w:tblCellMar>
-        </w:tblPrEx>
         <w:tc>
           <w:tcPr>
             <w:tcW w:w="2200" w:type="dxa"/>
@@ -22052,15 +21438,7 @@
       </w:r>
       <w:proofErr w:type="spellEnd"/>
       <w:r>
-        <w:t>) – RR(</w:t>
-      </w:r>
-      <w:proofErr w:type="spellStart"/>
-      <w:r>
-        <w:t>C_cf</w:t>
-      </w:r>
-      <w:proofErr w:type="spellEnd"/>
-      <w:r>
-        <w:t>)) / RR(</w:t>
+        <w:t>) – RR(C_cf)) / RR(</w:t>
       </w:r>
       <w:proofErr w:type="spellStart"/>
       <w:r>
@@ -22232,15 +21610,7 @@
       </w:r>
       <w:proofErr w:type="spellEnd"/>
       <w:r>
-        <w:t xml:space="preserve">, </w:t>
-      </w:r>
-      <w:proofErr w:type="spellStart"/>
-      <w:r>
-        <w:t>C_cf</w:t>
-      </w:r>
-      <w:proofErr w:type="spellEnd"/>
-      <w:r>
-        <w:t xml:space="preserve">) × </w:t>
+        <w:t xml:space="preserve">, C_cf) × </w:t>
       </w:r>
       <w:proofErr w:type="spellStart"/>
       <w:r>

</xml_diff>